<commit_message>
modificacion codigo y documento
</commit_message>
<xml_diff>
--- a/docs/Documentacion_Simple_Taller_3_SQLServer_MongoDB.docx
+++ b/docs/Documentacion_Simple_Taller_3_SQLServer_MongoDB.docx
@@ -53,6 +53,36 @@
     </w:p>
     <w:p>
       <w:pPr>
+        <w:spacing w:after="300"/>
+        <w:jc w:val="center"/>
+        <w:rPr>
+          <w:b/>
+          <w:lang w:val="es-CO"/>
+        </w:rPr>
+      </w:pPr>
+    </w:p>
+    <w:p>
+      <w:pPr>
+        <w:spacing w:after="300"/>
+        <w:jc w:val="center"/>
+        <w:rPr>
+          <w:b/>
+          <w:lang w:val="es-CO"/>
+        </w:rPr>
+      </w:pPr>
+    </w:p>
+    <w:p>
+      <w:pPr>
+        <w:spacing w:after="300"/>
+        <w:jc w:val="center"/>
+        <w:rPr>
+          <w:b/>
+          <w:lang w:val="es-CO"/>
+        </w:rPr>
+      </w:pPr>
+    </w:p>
+    <w:p>
+      <w:pPr>
         <w:spacing w:after="60"/>
         <w:jc w:val="center"/>
         <w:rPr>
@@ -61,10 +91,24 @@
       </w:pPr>
       <w:r>
         <w:rPr>
-          <w:b/>
           <w:lang w:val="es-CO"/>
         </w:rPr>
-        <w:t>Presentado por:</w:t>
+        <w:t xml:space="preserve">Sebastian Gonzalez </w:t>
+      </w:r>
+    </w:p>
+    <w:p>
+      <w:pPr>
+        <w:spacing w:after="60"/>
+        <w:jc w:val="center"/>
+        <w:rPr>
+          <w:lang w:val="es-CO"/>
+        </w:rPr>
+      </w:pPr>
+      <w:r>
+        <w:rPr>
+          <w:lang w:val="es-CO"/>
+        </w:rPr>
+        <w:t>Jose Bermudez</w:t>
       </w:r>
     </w:p>
     <w:p>
@@ -75,28 +119,6 @@
           <w:lang w:val="es-CO"/>
         </w:rPr>
       </w:pPr>
-      <w:r>
-        <w:rPr>
-          <w:lang w:val="es-CO"/>
-        </w:rPr>
-        <w:t>________________________________________</w:t>
-      </w:r>
-    </w:p>
-    <w:p>
-      <w:pPr>
-        <w:spacing w:after="60"/>
-        <w:jc w:val="center"/>
-        <w:rPr>
-          <w:lang w:val="es-CO"/>
-        </w:rPr>
-      </w:pPr>
-      <w:r>
-        <w:rPr>
-          <w:b/>
-          <w:lang w:val="es-CO"/>
-        </w:rPr>
-        <w:t>Presentado a:</w:t>
-      </w:r>
     </w:p>
     <w:p>
       <w:pPr>
@@ -106,12 +128,6 @@
           <w:lang w:val="es-CO"/>
         </w:rPr>
       </w:pPr>
-      <w:r>
-        <w:rPr>
-          <w:lang w:val="es-CO"/>
-        </w:rPr>
-        <w:t>________________________________________</w:t>
-      </w:r>
     </w:p>
     <w:p>
       <w:pPr>
@@ -121,18 +137,6 @@
           <w:lang w:val="es-CO"/>
         </w:rPr>
       </w:pPr>
-      <w:r>
-        <w:rPr>
-          <w:lang w:val="es-CO"/>
-        </w:rPr>
-        <w:t xml:space="preserve">Programa: </w:t>
-      </w:r>
-      <w:r>
-        <w:rPr>
-          <w:lang w:val="es-CO"/>
-        </w:rPr>
-        <w:t>__________________________________</w:t>
-      </w:r>
     </w:p>
     <w:p>
       <w:pPr>
@@ -146,7 +150,7 @@
         <w:rPr>
           <w:lang w:val="es-CO"/>
         </w:rPr>
-        <w:t>Institución: _________________________________</w:t>
+        <w:t>Universidad Católica Luis Amigo</w:t>
       </w:r>
     </w:p>
     <w:p>
@@ -161,31 +165,8 @@
         <w:rPr>
           <w:lang w:val="es-CO"/>
         </w:rPr>
-        <w:t>Fecha: _____________________________________</w:t>
+        <w:t>23/10/2026</w:t>
       </w:r>
-    </w:p>
-    <w:p>
-      <w:pPr>
-        <w:spacing w:after="0"/>
-        <w:jc w:val="center"/>
-        <w:rPr>
-          <w:lang w:val="es-CO"/>
-        </w:rPr>
-      </w:pPr>
-      <w:r>
-        <w:rPr>
-          <w:i/>
-          <w:lang w:val="es-CO"/>
-        </w:rPr>
-        <w:t>Documento técnico del proceso de migración y verificación de datos.</w:t>
-      </w:r>
-    </w:p>
-    <w:p>
-      <w:pPr>
-        <w:rPr>
-          <w:lang w:val="es-CO"/>
-        </w:rPr>
-      </w:pPr>
       <w:r>
         <w:rPr>
           <w:lang w:val="es-CO"/>
@@ -222,47 +203,7 @@
         <w:rPr>
           <w:lang w:val="es-CO"/>
         </w:rPr>
-        <w:t>El proyecto transforma la base de d</w:t>
-      </w:r>
-      <w:r>
-        <w:rPr>
-          <w:lang w:val="es-CO"/>
-        </w:rPr>
-        <w:t xml:space="preserve">atos </w:t>
-      </w:r>
-      <w:proofErr w:type="spellStart"/>
-      <w:r>
-        <w:rPr>
-          <w:lang w:val="es-CO"/>
-        </w:rPr>
-        <w:t>TiendaOnline</w:t>
-      </w:r>
-      <w:proofErr w:type="spellEnd"/>
-      <w:r>
-        <w:rPr>
-          <w:lang w:val="es-CO"/>
-        </w:rPr>
-        <w:t xml:space="preserve"> de SQL Server en una base documental llamada </w:t>
-      </w:r>
-      <w:proofErr w:type="spellStart"/>
-      <w:r>
-        <w:rPr>
-          <w:lang w:val="es-CO"/>
-        </w:rPr>
-        <w:t>tienda_online</w:t>
-      </w:r>
-      <w:proofErr w:type="spellEnd"/>
-      <w:r>
-        <w:rPr>
-          <w:lang w:val="es-CO"/>
-        </w:rPr>
-        <w:t xml:space="preserve"> en MongoDB. La migración se realiza con Python y reorganiza la información mediante documentos embebidos y referencias. Después se verifican los datos y se ejecutan consultas de a</w:t>
-      </w:r>
-      <w:r>
-        <w:rPr>
-          <w:lang w:val="es-CO"/>
-        </w:rPr>
-        <w:t>gregación para obtener información útil para el negocio.</w:t>
+        <w:t>El proyecto transforma la base de datos TiendaOnline de SQL Server en una base documental llamada tienda_online en MongoDB. La migración se realiza con Python y reorganiza la información mediante documentos embebidos y referencias. Después se verifican los datos y se ejecutan consultas de agregación para obtener información útil para el negocio.</w:t>
       </w:r>
     </w:p>
     <w:p>
@@ -350,7 +291,7 @@
         <w:rPr>
           <w:lang w:val="es-CO"/>
         </w:rPr>
-        <w:t>• 05_queries.py: contiene siete consultas de agregación.</w:t>
+        <w:t>• README.md: describe el modelo, las decisiones y cómo ejecutar el proyecto.</w:t>
       </w:r>
     </w:p>
     <w:p>
@@ -364,27 +305,7 @@
         <w:rPr>
           <w:lang w:val="es-CO"/>
         </w:rPr>
-        <w:t>• README.md: describe el modelo, las decisiones y cómo ejecutar el proyecto.</w:t>
-      </w:r>
-    </w:p>
-    <w:p>
-      <w:pPr>
-        <w:spacing w:after="40"/>
-        <w:rPr>
-          <w:lang w:val="es-CO"/>
-        </w:rPr>
-      </w:pPr>
-      <w:r>
-        <w:rPr>
-          <w:lang w:val="es-CO"/>
-        </w:rPr>
-        <w:t xml:space="preserve">• requirements.txt: lista las librerías </w:t>
-      </w:r>
-      <w:r>
-        <w:rPr>
-          <w:lang w:val="es-CO"/>
-        </w:rPr>
-        <w:t>necesarias.</w:t>
+        <w:t>• requirements.txt: lista las librerías necesarias.</w:t>
       </w:r>
     </w:p>
     <w:p>
@@ -415,91 +336,7 @@
         <w:rPr>
           <w:lang w:val="es-CO"/>
         </w:rPr>
-        <w:t xml:space="preserve">La base de datos </w:t>
-      </w:r>
-      <w:proofErr w:type="spellStart"/>
-      <w:r>
-        <w:rPr>
-          <w:lang w:val="es-CO"/>
-        </w:rPr>
-        <w:t>TiendaOnline</w:t>
-      </w:r>
-      <w:proofErr w:type="spellEnd"/>
-      <w:r>
-        <w:rPr>
-          <w:lang w:val="es-CO"/>
-        </w:rPr>
-        <w:t xml:space="preserve"> está compuesta por diez entidades: </w:t>
-      </w:r>
-      <w:proofErr w:type="spellStart"/>
-      <w:r>
-        <w:rPr>
-          <w:lang w:val="es-CO"/>
-        </w:rPr>
-        <w:t>Categoria</w:t>
-      </w:r>
-      <w:proofErr w:type="spellEnd"/>
-      <w:r>
-        <w:rPr>
-          <w:lang w:val="es-CO"/>
-        </w:rPr>
-        <w:t xml:space="preserve">, Proveedor, </w:t>
-      </w:r>
-      <w:proofErr w:type="spellStart"/>
-      <w:r>
-        <w:rPr>
-          <w:lang w:val="es-CO"/>
-        </w:rPr>
-        <w:t>MetodoPago</w:t>
-      </w:r>
-      <w:proofErr w:type="spellEnd"/>
-      <w:r>
-        <w:rPr>
-          <w:lang w:val="es-CO"/>
-        </w:rPr>
-        <w:t xml:space="preserve">, Producto, Cliente, </w:t>
-      </w:r>
-      <w:proofErr w:type="spellStart"/>
-      <w:r>
-        <w:rPr>
-          <w:lang w:val="es-CO"/>
-        </w:rPr>
-        <w:t>Direccion</w:t>
-      </w:r>
-      <w:proofErr w:type="spellEnd"/>
-      <w:r>
-        <w:rPr>
-          <w:lang w:val="es-CO"/>
-        </w:rPr>
-        <w:t xml:space="preserve">, Pedido, </w:t>
-      </w:r>
-      <w:proofErr w:type="spellStart"/>
-      <w:r>
-        <w:rPr>
-          <w:lang w:val="es-CO"/>
-        </w:rPr>
-        <w:t>DetallePedido</w:t>
-      </w:r>
-      <w:proofErr w:type="spellEnd"/>
-      <w:r>
-        <w:rPr>
-          <w:lang w:val="es-CO"/>
-        </w:rPr>
-        <w:t xml:space="preserve">, Pago y </w:t>
-      </w:r>
-      <w:proofErr w:type="spellStart"/>
-      <w:r>
-        <w:rPr>
-          <w:lang w:val="es-CO"/>
-        </w:rPr>
-        <w:t>Resena</w:t>
-      </w:r>
-      <w:proofErr w:type="spellEnd"/>
-      <w:r>
-        <w:rPr>
-          <w:lang w:val="es-CO"/>
-        </w:rPr>
-        <w:t>.</w:t>
+        <w:t>La base de datos TiendaOnline está compuesta por diez entidades: Categoria, Proveedor, MetodoPago, Producto, Cliente, Direccion, Pedido, DetallePedido, Pago y Resena.</w:t>
       </w:r>
     </w:p>
     <w:p>
@@ -512,15 +349,14 @@
       </w:pPr>
       <w:r>
         <w:rPr>
-          <w:i/>
           <w:noProof/>
           <w:lang w:val="es-CO"/>
         </w:rPr>
         <w:drawing>
-          <wp:inline distT="0" distB="0" distL="0" distR="0" wp14:anchorId="4298FDA8" wp14:editId="0BE47F09">
-            <wp:extent cx="5554980" cy="3703320"/>
-            <wp:effectExtent l="0" t="0" r="7620" b="0"/>
-            <wp:docPr id="2" name="Imagen 2"/>
+          <wp:inline distT="0" distB="0" distL="0" distR="0" wp14:anchorId="3C656BC3" wp14:editId="3873D754">
+            <wp:extent cx="5575300" cy="2901987"/>
+            <wp:effectExtent l="0" t="0" r="6350" b="0"/>
+            <wp:docPr id="18" name="Imagen 18"/>
             <wp:cNvGraphicFramePr>
               <a:graphicFrameLocks xmlns:a="http://schemas.openxmlformats.org/drawingml/2006/main" noChangeAspect="1"/>
             </wp:cNvGraphicFramePr>
@@ -528,7 +364,7 @@
               <a:graphicData uri="http://schemas.openxmlformats.org/drawingml/2006/picture">
                 <pic:pic xmlns:pic="http://schemas.openxmlformats.org/drawingml/2006/picture">
                   <pic:nvPicPr>
-                    <pic:cNvPr id="0" name="Picture 2"/>
+                    <pic:cNvPr id="0" name="Picture 8"/>
                     <pic:cNvPicPr>
                       <a:picLocks noChangeAspect="1" noChangeArrowheads="1"/>
                     </pic:cNvPicPr>
@@ -549,7 +385,7 @@
                   <pic:spPr bwMode="auto">
                     <a:xfrm>
                       <a:off x="0" y="0"/>
-                      <a:ext cx="5554980" cy="3703320"/>
+                      <a:ext cx="5587121" cy="2908140"/>
                     </a:xfrm>
                     <a:prstGeom prst="rect">
                       <a:avLst/>
@@ -578,15 +414,7 @@
           <w:color w:val="auto"/>
           <w:lang w:val="es-CO"/>
         </w:rPr>
-        <w:t>4</w:t>
-      </w:r>
-      <w:r>
-        <w:rPr>
-          <w:rFonts w:ascii="Arial" w:eastAsia="Arial" w:hAnsi="Arial"/>
-          <w:color w:val="auto"/>
-          <w:lang w:val="es-CO"/>
-        </w:rPr>
-        <w:t>. Modelo documental de MongoDB</w:t>
+        <w:t>4. Modelo documental de MongoDB</w:t>
       </w:r>
     </w:p>
     <w:p>
@@ -599,68 +427,20 @@
         <w:rPr>
           <w:lang w:val="es-CO"/>
         </w:rPr>
-        <w:t xml:space="preserve">La base de datos </w:t>
+        <w:t>La base de datos tienda_online contiene seis colecciones: clientes, productos, proveedores, metodos_pago, pedidos y resenas.</w:t>
       </w:r>
-      <w:proofErr w:type="spellStart"/>
+    </w:p>
+    <w:p>
+      <w:pPr>
+        <w:rPr>
+          <w:lang w:val="es-CO"/>
+        </w:rPr>
+      </w:pPr>
       <w:r>
         <w:rPr>
           <w:lang w:val="es-CO"/>
         </w:rPr>
-        <w:t>tienda_online</w:t>
-      </w:r>
-      <w:proofErr w:type="spellEnd"/>
-      <w:r>
-        <w:rPr>
-          <w:lang w:val="es-CO"/>
-        </w:rPr>
-        <w:t xml:space="preserve"> contiene seis colecciones: clientes, productos, proveedores, </w:t>
-      </w:r>
-      <w:proofErr w:type="spellStart"/>
-      <w:r>
-        <w:rPr>
-          <w:lang w:val="es-CO"/>
-        </w:rPr>
-        <w:t>metodos_pago</w:t>
-      </w:r>
-      <w:proofErr w:type="spellEnd"/>
-      <w:r>
-        <w:rPr>
-          <w:lang w:val="es-CO"/>
-        </w:rPr>
-        <w:t xml:space="preserve">, pedidos y </w:t>
-      </w:r>
-      <w:proofErr w:type="spellStart"/>
-      <w:r>
-        <w:rPr>
-          <w:lang w:val="es-CO"/>
-        </w:rPr>
-        <w:t>resenas</w:t>
-      </w:r>
-      <w:proofErr w:type="spellEnd"/>
-      <w:r>
-        <w:rPr>
-          <w:lang w:val="es-CO"/>
-        </w:rPr>
-        <w:t>.</w:t>
-      </w:r>
-    </w:p>
-    <w:p>
-      <w:pPr>
-        <w:rPr>
-          <w:lang w:val="es-CO"/>
-        </w:rPr>
-      </w:pPr>
-      <w:r>
-        <w:rPr>
-          <w:lang w:val="es-CO"/>
-        </w:rPr>
-        <w:t>Las direcciones se embeben</w:t>
-      </w:r>
-      <w:r>
-        <w:rPr>
-          <w:lang w:val="es-CO"/>
-        </w:rPr>
-        <w:t xml:space="preserve"> en clientes; los productos incluyen la categoría y referencian al proveedor; los pedidos incluyen artículos, pago y dirección de envío, y referencian al cliente; las reseñas referencian al cliente y al producto.</w:t>
+        <w:t>Las direcciones se embeben en clientes; los productos incluyen la categoría y referencian al proveedor; los pedidos incluyen artículos, pago y dirección de envío, y referencian al cliente; las reseñas referencian al cliente y al producto.</w:t>
       </w:r>
     </w:p>
     <w:p>
@@ -685,13 +465,14 @@
       <w:r>
         <w:rPr>
           <w:i/>
+          <w:noProof/>
           <w:lang w:val="es-CO"/>
         </w:rPr>
         <w:lastRenderedPageBreak/>
         <w:drawing>
-          <wp:inline distT="0" distB="0" distL="0" distR="0" wp14:anchorId="7C0F0355" wp14:editId="66FFD68D">
-            <wp:extent cx="3581900" cy="2400635"/>
-            <wp:effectExtent l="0" t="0" r="0" b="0"/>
+          <wp:inline distT="0" distB="0" distL="0" distR="0" wp14:anchorId="7C0F0355" wp14:editId="155F6F25">
+            <wp:extent cx="2927350" cy="1961947"/>
+            <wp:effectExtent l="0" t="0" r="6350" b="635"/>
             <wp:docPr id="1" name="Imagen 1"/>
             <wp:cNvGraphicFramePr>
               <a:graphicFrameLocks xmlns:a="http://schemas.openxmlformats.org/drawingml/2006/main" noChangeAspect="1"/>
@@ -712,7 +493,7 @@
                   <pic:spPr>
                     <a:xfrm>
                       <a:off x="0" y="0"/>
-                      <a:ext cx="3581900" cy="2400635"/>
+                      <a:ext cx="2930882" cy="1964315"/>
                     </a:xfrm>
                     <a:prstGeom prst="rect">
                       <a:avLst/>
@@ -833,23 +614,7 @@
         <w:spacing w:after="40"/>
       </w:pPr>
       <w:r>
-        <w:t xml:space="preserve">• </w:t>
-      </w:r>
-      <w:proofErr w:type="spellStart"/>
-      <w:r>
-        <w:t>Ejecutar</w:t>
-      </w:r>
-      <w:proofErr w:type="spellEnd"/>
-      <w:r>
-        <w:t xml:space="preserve"> 01_schema.sql </w:t>
-      </w:r>
-      <w:proofErr w:type="spellStart"/>
-      <w:r>
-        <w:t>en</w:t>
-      </w:r>
-      <w:proofErr w:type="spellEnd"/>
-      <w:r>
-        <w:t xml:space="preserve"> SQL Server Management Studio.</w:t>
+        <w:t>• Ejecutar 01_schema.sql en SQL Server Management Studio.</w:t>
       </w:r>
     </w:p>
     <w:p>
@@ -863,111 +628,35 @@
         <w:rPr>
           <w:lang w:val="es-CO"/>
         </w:rPr>
-        <w:t xml:space="preserve">• Ejecutar </w:t>
+        <w:t>• Ejecutar python 02_generate_data.py.</w:t>
       </w:r>
-      <w:proofErr w:type="spellStart"/>
+    </w:p>
+    <w:p>
+      <w:pPr>
+        <w:spacing w:after="40"/>
+        <w:rPr>
+          <w:lang w:val="es-CO"/>
+        </w:rPr>
+      </w:pPr>
       <w:r>
         <w:rPr>
           <w:lang w:val="es-CO"/>
         </w:rPr>
-        <w:t>python</w:t>
+        <w:t>• Ejecutar python 03_migrate.py.</w:t>
       </w:r>
-      <w:proofErr w:type="spellEnd"/>
+    </w:p>
+    <w:p>
+      <w:pPr>
+        <w:spacing w:after="40"/>
+        <w:rPr>
+          <w:lang w:val="es-CO"/>
+        </w:rPr>
+      </w:pPr>
       <w:r>
         <w:rPr>
           <w:lang w:val="es-CO"/>
         </w:rPr>
-        <w:t xml:space="preserve"> 02_generate_data.py.</w:t>
-      </w:r>
-    </w:p>
-    <w:p>
-      <w:pPr>
-        <w:spacing w:after="40"/>
-        <w:rPr>
-          <w:lang w:val="es-CO"/>
-        </w:rPr>
-      </w:pPr>
-      <w:r>
-        <w:rPr>
-          <w:lang w:val="es-CO"/>
-        </w:rPr>
-        <w:t xml:space="preserve">• Ejecutar </w:t>
-      </w:r>
-      <w:proofErr w:type="spellStart"/>
-      <w:r>
-        <w:rPr>
-          <w:lang w:val="es-CO"/>
-        </w:rPr>
-        <w:t>python</w:t>
-      </w:r>
-      <w:proofErr w:type="spellEnd"/>
-      <w:r>
-        <w:rPr>
-          <w:lang w:val="es-CO"/>
-        </w:rPr>
-        <w:t xml:space="preserve"> 03_migrate.py.</w:t>
-      </w:r>
-    </w:p>
-    <w:p>
-      <w:pPr>
-        <w:spacing w:after="40"/>
-        <w:rPr>
-          <w:lang w:val="es-CO"/>
-        </w:rPr>
-      </w:pPr>
-      <w:r>
-        <w:rPr>
-          <w:lang w:val="es-CO"/>
-        </w:rPr>
-        <w:t xml:space="preserve">• </w:t>
-      </w:r>
-      <w:r>
-        <w:rPr>
-          <w:lang w:val="es-CO"/>
-        </w:rPr>
-        <w:t xml:space="preserve">Ejecutar </w:t>
-      </w:r>
-      <w:proofErr w:type="spellStart"/>
-      <w:r>
-        <w:rPr>
-          <w:lang w:val="es-CO"/>
-        </w:rPr>
-        <w:t>python</w:t>
-      </w:r>
-      <w:proofErr w:type="spellEnd"/>
-      <w:r>
-        <w:rPr>
-          <w:lang w:val="es-CO"/>
-        </w:rPr>
-        <w:t xml:space="preserve"> 04_verify.py.</w:t>
-      </w:r>
-    </w:p>
-    <w:p>
-      <w:pPr>
-        <w:spacing w:after="40"/>
-        <w:rPr>
-          <w:lang w:val="es-CO"/>
-        </w:rPr>
-      </w:pPr>
-      <w:r>
-        <w:rPr>
-          <w:lang w:val="es-CO"/>
-        </w:rPr>
-        <w:t xml:space="preserve">• Ejecutar </w:t>
-      </w:r>
-      <w:proofErr w:type="spellStart"/>
-      <w:r>
-        <w:rPr>
-          <w:lang w:val="es-CO"/>
-        </w:rPr>
-        <w:t>python</w:t>
-      </w:r>
-      <w:proofErr w:type="spellEnd"/>
-      <w:r>
-        <w:rPr>
-          <w:lang w:val="es-CO"/>
-        </w:rPr>
-        <w:t xml:space="preserve"> 05_queries.py.</w:t>
+        <w:t>• Ejecutar python 04_verify.py.</w:t>
       </w:r>
     </w:p>
     <w:p>
@@ -995,6 +684,7 @@
       <w:r>
         <w:rPr>
           <w:i/>
+          <w:noProof/>
           <w:lang w:val="es-CO"/>
         </w:rPr>
         <w:lastRenderedPageBreak/>
@@ -1054,6 +744,7 @@
       <w:r>
         <w:rPr>
           <w:rFonts w:ascii="Arial" w:eastAsia="Arial" w:hAnsi="Arial"/>
+          <w:noProof/>
           <w:color w:val="auto"/>
           <w:lang w:val="es-CO"/>
         </w:rPr>
@@ -1099,36 +790,8 @@
           <w:color w:val="auto"/>
           <w:lang w:val="es-CO"/>
         </w:rPr>
-        <w:t xml:space="preserve">6. Decisiones de </w:t>
+        <w:t>6. Decisiones de Embedding y Referencing</w:t>
       </w:r>
-      <w:proofErr w:type="spellStart"/>
-      <w:r>
-        <w:rPr>
-          <w:rFonts w:ascii="Arial" w:eastAsia="Arial" w:hAnsi="Arial"/>
-          <w:color w:val="auto"/>
-          <w:lang w:val="es-CO"/>
-        </w:rPr>
-        <w:t>Embedding</w:t>
-      </w:r>
-      <w:proofErr w:type="spellEnd"/>
-      <w:r>
-        <w:rPr>
-          <w:rFonts w:ascii="Arial" w:eastAsia="Arial" w:hAnsi="Arial"/>
-          <w:color w:val="auto"/>
-          <w:lang w:val="es-CO"/>
-        </w:rPr>
-        <w:t xml:space="preserve"> y </w:t>
-      </w:r>
-      <w:proofErr w:type="spellStart"/>
-      <w:r>
-        <w:rPr>
-          <w:rFonts w:ascii="Arial" w:eastAsia="Arial" w:hAnsi="Arial"/>
-          <w:color w:val="auto"/>
-          <w:lang w:val="es-CO"/>
-        </w:rPr>
-        <w:t>Referencing</w:t>
-      </w:r>
-      <w:proofErr w:type="spellEnd"/>
     </w:p>
     <w:p>
       <w:pPr>
@@ -1136,52 +799,28 @@
           <w:lang w:val="es-CO"/>
         </w:rPr>
       </w:pPr>
-      <w:proofErr w:type="spellStart"/>
       <w:r>
         <w:rPr>
           <w:lang w:val="es-CO"/>
         </w:rPr>
-        <w:t>Embedding</w:t>
+        <w:t>Embedding: se usa para datos que suelen consultarse junto con el documento principal. Por eso las direcciones forman parte del cliente y los artículos, el pago y la dirección de envío forman parte del pedido.</w:t>
       </w:r>
-      <w:proofErr w:type="spellEnd"/>
+    </w:p>
+    <w:p>
+      <w:pPr>
+        <w:rPr>
+          <w:lang w:val="es-CO"/>
+        </w:rPr>
+      </w:pPr>
       <w:r>
         <w:rPr>
           <w:lang w:val="es-CO"/>
         </w:rPr>
-        <w:t>: se usa para datos que suelen consultarse junto con el documento principal. Por eso las direcciones forman parte del cliente y los artículos, el pago y la dirección de envío forman parte del pedido.</w:t>
+        <w:t>Referencing: se usa para mantener documentos independientes y relacionarlos mediante identificadores. Los productos referencian a proveedores; los pedidos, a clientes; y las reseñas, a clientes y productos.</w:t>
       </w:r>
     </w:p>
     <w:p>
       <w:pPr>
-        <w:rPr>
-          <w:lang w:val="es-CO"/>
-        </w:rPr>
-      </w:pPr>
-      <w:proofErr w:type="spellStart"/>
-      <w:r>
-        <w:rPr>
-          <w:lang w:val="es-CO"/>
-        </w:rPr>
-        <w:t>Referencing</w:t>
-      </w:r>
-      <w:proofErr w:type="spellEnd"/>
-      <w:r>
-        <w:rPr>
-          <w:lang w:val="es-CO"/>
-        </w:rPr>
-        <w:t>: se usa para mantener d</w:t>
-      </w:r>
-      <w:r>
-        <w:rPr>
-          <w:lang w:val="es-CO"/>
-        </w:rPr>
-        <w:t>ocumentos independientes y relacionarlos mediante identificadores. Los productos referencian a proveedores; los pedidos, a clientes; y las reseñas, a clientes y productos.</w:t>
-      </w:r>
-    </w:p>
-    <w:p>
-      <w:pPr>
-        <w:spacing w:before="160" w:after="40"/>
-        <w:jc w:val="center"/>
         <w:rPr>
           <w:lang w:val="es-CO"/>
         </w:rPr>
@@ -1191,29 +830,7 @@
           <w:i/>
           <w:lang w:val="es-CO"/>
         </w:rPr>
-        <w:t>[PEGAR AQUÍ UNA CAPTURA QUE MUESTRE UN EJEMPLO DE EMBEDDING Y/O REFERENCING]</w:t>
-      </w:r>
-    </w:p>
-    <w:p>
-      <w:pPr>
-        <w:jc w:val="center"/>
-        <w:rPr>
-          <w:lang w:val="es-CO"/>
-        </w:rPr>
-      </w:pPr>
-      <w:r>
-        <w:rPr>
-          <w:i/>
-          <w:lang w:val="es-CO"/>
-        </w:rPr>
-        <w:t xml:space="preserve">Figura </w:t>
-      </w:r>
-      <w:r>
-        <w:rPr>
-          <w:i/>
-          <w:lang w:val="es-CO"/>
-        </w:rPr>
-        <w:t>7. Ejemplo de decisiones de modelado.</w:t>
+        <w:t>.</w:t>
       </w:r>
     </w:p>
     <w:p>
@@ -1237,44 +854,11 @@
     </w:p>
     <w:p>
       <w:pPr>
+        <w:spacing w:after="40"/>
         <w:rPr>
           <w:lang w:val="es-CO"/>
         </w:rPr>
       </w:pPr>
-      <w:r>
-        <w:rPr>
-          <w:lang w:val="es-CO"/>
-        </w:rPr>
-        <w:t>El archivo 05_queries.py incluye siete consultas con operadores de agregación, entre ellos $match, $</w:t>
-      </w:r>
-      <w:proofErr w:type="spellStart"/>
-      <w:r>
-        <w:rPr>
-          <w:lang w:val="es-CO"/>
-        </w:rPr>
-        <w:t>lookup</w:t>
-      </w:r>
-      <w:proofErr w:type="spellEnd"/>
-      <w:r>
-        <w:rPr>
-          <w:lang w:val="es-CO"/>
-        </w:rPr>
-        <w:t xml:space="preserve"> y $</w:t>
-      </w:r>
-      <w:proofErr w:type="spellStart"/>
-      <w:r>
-        <w:rPr>
-          <w:lang w:val="es-CO"/>
-        </w:rPr>
-        <w:t>project</w:t>
-      </w:r>
-      <w:proofErr w:type="spellEnd"/>
-      <w:r>
-        <w:rPr>
-          <w:lang w:val="es-CO"/>
-        </w:rPr>
-        <w:t>. Cada consulta responde una pregunta de negocio:</w:t>
-      </w:r>
     </w:p>
     <w:p>
       <w:pPr>
@@ -1288,14 +872,7 @@
           <w:b/>
           <w:lang w:val="es-CO"/>
         </w:rPr>
-        <w:t>1. Productos más vendido</w:t>
-      </w:r>
-      <w:r>
-        <w:rPr>
-          <w:b/>
-          <w:lang w:val="es-CO"/>
-        </w:rPr>
-        <w:t xml:space="preserve">s: </w:t>
+        <w:t xml:space="preserve">1. Productos más vendidos: </w:t>
       </w:r>
       <w:r>
         <w:rPr>
@@ -1379,14 +956,7 @@
           <w:b/>
           <w:lang w:val="es-CO"/>
         </w:rPr>
-        <w:t>5. Productos mej</w:t>
-      </w:r>
-      <w:r>
-        <w:rPr>
-          <w:b/>
-          <w:lang w:val="es-CO"/>
-        </w:rPr>
-        <w:t xml:space="preserve">or calificados y proveedores: </w:t>
+        <w:t xml:space="preserve">5. Productos mejor calificados y proveedores: </w:t>
       </w:r>
       <w:r>
         <w:rPr>
@@ -1473,47 +1043,7 @@
         <w:rPr>
           <w:lang w:val="es-CO"/>
         </w:rPr>
-        <w:t xml:space="preserve">La migración permitió reorganizar los datos relacionales en un modelo documental adaptado a las consultas del sistema. El uso de </w:t>
-      </w:r>
-      <w:proofErr w:type="spellStart"/>
-      <w:r>
-        <w:rPr>
-          <w:lang w:val="es-CO"/>
-        </w:rPr>
-        <w:t>embeddin</w:t>
-      </w:r>
-      <w:r>
-        <w:rPr>
-          <w:lang w:val="es-CO"/>
-        </w:rPr>
-        <w:t>g</w:t>
-      </w:r>
-      <w:proofErr w:type="spellEnd"/>
-      <w:r>
-        <w:rPr>
-          <w:lang w:val="es-CO"/>
-        </w:rPr>
-        <w:t xml:space="preserve"> facilita recuperar información relacionada en un mismo documento, mientras que </w:t>
-      </w:r>
-      <w:proofErr w:type="spellStart"/>
-      <w:r>
-        <w:rPr>
-          <w:lang w:val="es-CO"/>
-        </w:rPr>
-        <w:t>referencing</w:t>
-      </w:r>
-      <w:proofErr w:type="spellEnd"/>
-      <w:r>
-        <w:rPr>
-          <w:lang w:val="es-CO"/>
-        </w:rPr>
-        <w:t xml:space="preserve"> conserva relaciones entre documentos independientes. La verificación y las consultas de agregación permiten comprobar el resultado y obtener información útil para </w:t>
-      </w:r>
-      <w:r>
-        <w:rPr>
-          <w:lang w:val="es-CO"/>
-        </w:rPr>
-        <w:t>el análisis del negocio.</w:t>
+        <w:t>La migración permitió reorganizar los datos relacionales en un modelo documental adaptado a las consultas del sistema. El uso de embedding facilita recuperar información relacionada en un mismo documento, mientras que referencing conserva relaciones entre documentos independientes. La verificación y las consultas de agregación permiten comprobar el resultado y obtener información útil para el análisis del negocio.</w:t>
       </w:r>
     </w:p>
     <w:p>
@@ -1544,6 +1074,7 @@
       </w:pPr>
       <w:r>
         <w:rPr>
+          <w:noProof/>
           <w:lang w:val="es-CO"/>
         </w:rPr>
         <w:drawing>
@@ -2154,11 +1685,6 @@
     <w:lsdException w:name="Book Title" w:uiPriority="33" w:qFormat="1"/>
     <w:lsdException w:name="Bibliography" w:semiHidden="1" w:uiPriority="37" w:unhideWhenUsed="1"/>
     <w:lsdException w:name="TOC Heading" w:semiHidden="1" w:uiPriority="39" w:unhideWhenUsed="1" w:qFormat="1"/>
-    <w:lsdException w:name="Plain Table 5" w:semiHidden="1" w:unhideWhenUsed="1"/>
-    <w:lsdException w:name="Grid Table Light" w:semiHidden="1" w:unhideWhenUsed="1"/>
-    <w:lsdException w:name="Grid Table 1 Light" w:semiHidden="1" w:unhideWhenUsed="1"/>
-    <w:lsdException w:name="Grid Table 2" w:semiHidden="1" w:unhideWhenUsed="1"/>
-    <w:lsdException w:name="Grid Table 3" w:semiHidden="1" w:unhideWhenUsed="1"/>
     <w:lsdException w:name="Grid Table 4" w:uiPriority="49"/>
     <w:lsdException w:name="Grid Table 5 Dark" w:uiPriority="50"/>
     <w:lsdException w:name="Grid Table 6 Colorful" w:uiPriority="51"/>

</xml_diff>

<commit_message>
Documento con cambios en los modelos de la bd relacional y no relacional
</commit_message>
<xml_diff>
--- a/docs/Documentacion_Simple_Taller_3_SQLServer_MongoDB.docx
+++ b/docs/Documentacion_Simple_Taller_3_SQLServer_MongoDB.docx
@@ -104,12 +104,28 @@
           <w:lang w:val="es-CO"/>
         </w:rPr>
       </w:pPr>
+      <w:proofErr w:type="spellStart"/>
       <w:r>
         <w:rPr>
           <w:lang w:val="es-CO"/>
         </w:rPr>
-        <w:t>Jose Bermudez</w:t>
+        <w:t>Jose</w:t>
       </w:r>
+      <w:proofErr w:type="spellEnd"/>
+      <w:r>
+        <w:rPr>
+          <w:lang w:val="es-CO"/>
+        </w:rPr>
+        <w:t xml:space="preserve"> </w:t>
+      </w:r>
+      <w:proofErr w:type="spellStart"/>
+      <w:r>
+        <w:rPr>
+          <w:lang w:val="es-CO"/>
+        </w:rPr>
+        <w:t>Bermudez</w:t>
+      </w:r>
+      <w:proofErr w:type="spellEnd"/>
     </w:p>
     <w:p>
       <w:pPr>
@@ -203,7 +219,35 @@
         <w:rPr>
           <w:lang w:val="es-CO"/>
         </w:rPr>
-        <w:t>El proyecto transforma la base de datos TiendaOnline de SQL Server en una base documental llamada tienda_online en MongoDB. La migración se realiza con Python y reorganiza la información mediante documentos embebidos y referencias. Después se verifican los datos y se ejecutan consultas de agregación para obtener información útil para el negocio.</w:t>
+        <w:t xml:space="preserve">El proyecto transforma la base de datos </w:t>
+      </w:r>
+      <w:proofErr w:type="spellStart"/>
+      <w:r>
+        <w:rPr>
+          <w:lang w:val="es-CO"/>
+        </w:rPr>
+        <w:t>TiendaOnline</w:t>
+      </w:r>
+      <w:proofErr w:type="spellEnd"/>
+      <w:r>
+        <w:rPr>
+          <w:lang w:val="es-CO"/>
+        </w:rPr>
+        <w:t xml:space="preserve"> de SQL Server en una base documental llamada </w:t>
+      </w:r>
+      <w:proofErr w:type="spellStart"/>
+      <w:r>
+        <w:rPr>
+          <w:lang w:val="es-CO"/>
+        </w:rPr>
+        <w:t>tienda_online</w:t>
+      </w:r>
+      <w:proofErr w:type="spellEnd"/>
+      <w:r>
+        <w:rPr>
+          <w:lang w:val="es-CO"/>
+        </w:rPr>
+        <w:t xml:space="preserve"> en MongoDB. La migración se realiza con Python y reorganiza la información mediante documentos embebidos y referencias. Después se verifican los datos y se ejecutan consultas de agregación para obtener información útil para el negocio.</w:t>
       </w:r>
     </w:p>
     <w:p>
@@ -323,7 +367,7 @@
           <w:color w:val="auto"/>
           <w:lang w:val="es-CO"/>
         </w:rPr>
-        <w:t>3. Modelo relacional de origen</w:t>
+        <w:t xml:space="preserve">3. Modelo relacional </w:t>
       </w:r>
     </w:p>
     <w:p>
@@ -336,13 +380,95 @@
         <w:rPr>
           <w:lang w:val="es-CO"/>
         </w:rPr>
-        <w:t>La base de datos TiendaOnline está compuesta por diez entidades: Categoria, Proveedor, MetodoPago, Producto, Cliente, Direccion, Pedido, DetallePedido, Pago y Resena.</w:t>
+        <w:t xml:space="preserve">La base de datos </w:t>
+      </w:r>
+      <w:proofErr w:type="spellStart"/>
+      <w:r>
+        <w:rPr>
+          <w:lang w:val="es-CO"/>
+        </w:rPr>
+        <w:t>TiendaOnline</w:t>
+      </w:r>
+      <w:proofErr w:type="spellEnd"/>
+      <w:r>
+        <w:rPr>
+          <w:lang w:val="es-CO"/>
+        </w:rPr>
+        <w:t xml:space="preserve"> está compuesta por diez entidades: </w:t>
+      </w:r>
+      <w:proofErr w:type="spellStart"/>
+      <w:r>
+        <w:rPr>
+          <w:lang w:val="es-CO"/>
+        </w:rPr>
+        <w:t>Categoria</w:t>
+      </w:r>
+      <w:proofErr w:type="spellEnd"/>
+      <w:r>
+        <w:rPr>
+          <w:lang w:val="es-CO"/>
+        </w:rPr>
+        <w:t xml:space="preserve">, Proveedor, </w:t>
+      </w:r>
+      <w:proofErr w:type="spellStart"/>
+      <w:r>
+        <w:rPr>
+          <w:lang w:val="es-CO"/>
+        </w:rPr>
+        <w:t>MetodoPago</w:t>
+      </w:r>
+      <w:proofErr w:type="spellEnd"/>
+      <w:r>
+        <w:rPr>
+          <w:lang w:val="es-CO"/>
+        </w:rPr>
+        <w:t xml:space="preserve">, Producto, Cliente, </w:t>
+      </w:r>
+      <w:proofErr w:type="spellStart"/>
+      <w:r>
+        <w:rPr>
+          <w:lang w:val="es-CO"/>
+        </w:rPr>
+        <w:t>Direccion</w:t>
+      </w:r>
+      <w:proofErr w:type="spellEnd"/>
+      <w:r>
+        <w:rPr>
+          <w:lang w:val="es-CO"/>
+        </w:rPr>
+        <w:t xml:space="preserve">, Pedido, </w:t>
+      </w:r>
+      <w:proofErr w:type="spellStart"/>
+      <w:r>
+        <w:rPr>
+          <w:lang w:val="es-CO"/>
+        </w:rPr>
+        <w:t>DetallePedido</w:t>
+      </w:r>
+      <w:proofErr w:type="spellEnd"/>
+      <w:r>
+        <w:rPr>
+          <w:lang w:val="es-CO"/>
+        </w:rPr>
+        <w:t xml:space="preserve">, Pago y </w:t>
+      </w:r>
+      <w:proofErr w:type="spellStart"/>
+      <w:r>
+        <w:rPr>
+          <w:lang w:val="es-CO"/>
+        </w:rPr>
+        <w:t>Resena</w:t>
+      </w:r>
+      <w:proofErr w:type="spellEnd"/>
+      <w:r>
+        <w:rPr>
+          <w:lang w:val="es-CO"/>
+        </w:rPr>
+        <w:t>.</w:t>
       </w:r>
     </w:p>
     <w:p>
       <w:pPr>
-        <w:spacing w:before="160" w:after="40"/>
-        <w:jc w:val="center"/>
         <w:rPr>
           <w:lang w:val="es-CO"/>
         </w:rPr>
@@ -353,10 +479,10 @@
           <w:lang w:val="es-CO"/>
         </w:rPr>
         <w:drawing>
-          <wp:inline distT="0" distB="0" distL="0" distR="0" wp14:anchorId="3C656BC3" wp14:editId="3873D754">
-            <wp:extent cx="5575300" cy="2901987"/>
-            <wp:effectExtent l="0" t="0" r="6350" b="0"/>
-            <wp:docPr id="18" name="Imagen 18"/>
+          <wp:inline distT="0" distB="0" distL="0" distR="0" wp14:anchorId="7C1D91ED" wp14:editId="02FAEC34">
+            <wp:extent cx="6379028" cy="2531360"/>
+            <wp:effectExtent l="0" t="0" r="3175" b="2540"/>
+            <wp:docPr id="3" name="Imagen 3"/>
             <wp:cNvGraphicFramePr>
               <a:graphicFrameLocks xmlns:a="http://schemas.openxmlformats.org/drawingml/2006/main" noChangeAspect="1"/>
             </wp:cNvGraphicFramePr>
@@ -364,7 +490,7 @@
               <a:graphicData uri="http://schemas.openxmlformats.org/drawingml/2006/picture">
                 <pic:pic xmlns:pic="http://schemas.openxmlformats.org/drawingml/2006/picture">
                   <pic:nvPicPr>
-                    <pic:cNvPr id="0" name="Picture 8"/>
+                    <pic:cNvPr id="0" name="Picture 2"/>
                     <pic:cNvPicPr>
                       <a:picLocks noChangeAspect="1" noChangeArrowheads="1"/>
                     </pic:cNvPicPr>
@@ -385,7 +511,7 @@
                   <pic:spPr bwMode="auto">
                     <a:xfrm>
                       <a:off x="0" y="0"/>
-                      <a:ext cx="5587121" cy="2908140"/>
+                      <a:ext cx="6461654" cy="2564148"/>
                     </a:xfrm>
                     <a:prstGeom prst="rect">
                       <a:avLst/>
@@ -401,6 +527,15 @@
     </w:p>
     <w:p>
       <w:pPr>
+        <w:spacing w:before="160" w:after="40"/>
+        <w:jc w:val="center"/>
+        <w:rPr>
+          <w:lang w:val="es-CO"/>
+        </w:rPr>
+      </w:pPr>
+    </w:p>
+    <w:p>
+      <w:pPr>
         <w:pStyle w:val="Ttulo1"/>
         <w:spacing w:before="100" w:after="60"/>
         <w:rPr>
@@ -427,7 +562,49 @@
         <w:rPr>
           <w:lang w:val="es-CO"/>
         </w:rPr>
-        <w:t>La base de datos tienda_online contiene seis colecciones: clientes, productos, proveedores, metodos_pago, pedidos y resenas.</w:t>
+        <w:t xml:space="preserve">La base de datos </w:t>
+      </w:r>
+      <w:proofErr w:type="spellStart"/>
+      <w:r>
+        <w:rPr>
+          <w:lang w:val="es-CO"/>
+        </w:rPr>
+        <w:t>tienda_online</w:t>
+      </w:r>
+      <w:proofErr w:type="spellEnd"/>
+      <w:r>
+        <w:rPr>
+          <w:lang w:val="es-CO"/>
+        </w:rPr>
+        <w:t xml:space="preserve"> contiene seis colecciones: clientes, productos, proveedores, </w:t>
+      </w:r>
+      <w:proofErr w:type="spellStart"/>
+      <w:r>
+        <w:rPr>
+          <w:lang w:val="es-CO"/>
+        </w:rPr>
+        <w:t>metodos_pago</w:t>
+      </w:r>
+      <w:proofErr w:type="spellEnd"/>
+      <w:r>
+        <w:rPr>
+          <w:lang w:val="es-CO"/>
+        </w:rPr>
+        <w:t xml:space="preserve">, pedidos y </w:t>
+      </w:r>
+      <w:proofErr w:type="spellStart"/>
+      <w:r>
+        <w:rPr>
+          <w:lang w:val="es-CO"/>
+        </w:rPr>
+        <w:t>resenas</w:t>
+      </w:r>
+      <w:proofErr w:type="spellEnd"/>
+      <w:r>
+        <w:rPr>
+          <w:lang w:val="es-CO"/>
+        </w:rPr>
+        <w:t>.</w:t>
       </w:r>
     </w:p>
     <w:p>
@@ -532,10 +709,10 @@
           <w:lang w:val="es-CO"/>
         </w:rPr>
         <w:drawing>
-          <wp:inline distT="0" distB="0" distL="0" distR="0" wp14:anchorId="7893BBBE" wp14:editId="17837975">
-            <wp:extent cx="4754880" cy="3169920"/>
-            <wp:effectExtent l="0" t="0" r="7620" b="0"/>
-            <wp:docPr id="4" name="Imagen 4"/>
+          <wp:inline distT="0" distB="0" distL="0" distR="0" wp14:anchorId="09414ED6" wp14:editId="30A4DEB6">
+            <wp:extent cx="6240209" cy="3540792"/>
+            <wp:effectExtent l="0" t="0" r="8255" b="2540"/>
+            <wp:docPr id="9" name="Imagen 9"/>
             <wp:cNvGraphicFramePr>
               <a:graphicFrameLocks xmlns:a="http://schemas.openxmlformats.org/drawingml/2006/main" noChangeAspect="1"/>
             </wp:cNvGraphicFramePr>
@@ -564,7 +741,7 @@
                   <pic:spPr bwMode="auto">
                     <a:xfrm>
                       <a:off x="0" y="0"/>
-                      <a:ext cx="4769853" cy="3179902"/>
+                      <a:ext cx="6264804" cy="3554748"/>
                     </a:xfrm>
                     <a:prstGeom prst="rect">
                       <a:avLst/>
@@ -580,6 +757,26 @@
     </w:p>
     <w:p>
       <w:pPr>
+        <w:spacing w:before="160" w:after="40"/>
+        <w:jc w:val="center"/>
+        <w:rPr>
+          <w:i/>
+          <w:lang w:val="es-CO"/>
+        </w:rPr>
+      </w:pPr>
+    </w:p>
+    <w:p>
+      <w:pPr>
+        <w:spacing w:before="160" w:after="40"/>
+        <w:jc w:val="center"/>
+        <w:rPr>
+          <w:i/>
+          <w:lang w:val="es-CO"/>
+        </w:rPr>
+      </w:pPr>
+    </w:p>
+    <w:p>
+      <w:pPr>
         <w:pStyle w:val="Ttulo1"/>
         <w:spacing w:before="100" w:after="60"/>
         <w:rPr>
@@ -614,7 +811,23 @@
         <w:spacing w:after="40"/>
       </w:pPr>
       <w:r>
-        <w:t>• Ejecutar 01_schema.sql en SQL Server Management Studio.</w:t>
+        <w:t xml:space="preserve">• </w:t>
+      </w:r>
+      <w:proofErr w:type="spellStart"/>
+      <w:r>
+        <w:t>Ejecutar</w:t>
+      </w:r>
+      <w:proofErr w:type="spellEnd"/>
+      <w:r>
+        <w:t xml:space="preserve"> 01_schema.sql </w:t>
+      </w:r>
+      <w:proofErr w:type="spellStart"/>
+      <w:r>
+        <w:t>en</w:t>
+      </w:r>
+      <w:proofErr w:type="spellEnd"/>
+      <w:r>
+        <w:t xml:space="preserve"> SQL Server Management Studio.</w:t>
       </w:r>
     </w:p>
     <w:p>
@@ -628,7 +841,21 @@
         <w:rPr>
           <w:lang w:val="es-CO"/>
         </w:rPr>
-        <w:t>• Ejecutar python 02_generate_data.py.</w:t>
+        <w:t xml:space="preserve">• Ejecutar </w:t>
+      </w:r>
+      <w:proofErr w:type="spellStart"/>
+      <w:r>
+        <w:rPr>
+          <w:lang w:val="es-CO"/>
+        </w:rPr>
+        <w:t>python</w:t>
+      </w:r>
+      <w:proofErr w:type="spellEnd"/>
+      <w:r>
+        <w:rPr>
+          <w:lang w:val="es-CO"/>
+        </w:rPr>
+        <w:t xml:space="preserve"> 02_generate_data.py.</w:t>
       </w:r>
     </w:p>
     <w:p>
@@ -642,7 +869,21 @@
         <w:rPr>
           <w:lang w:val="es-CO"/>
         </w:rPr>
-        <w:t>• Ejecutar python 03_migrate.py.</w:t>
+        <w:t xml:space="preserve">• Ejecutar </w:t>
+      </w:r>
+      <w:proofErr w:type="spellStart"/>
+      <w:r>
+        <w:rPr>
+          <w:lang w:val="es-CO"/>
+        </w:rPr>
+        <w:t>python</w:t>
+      </w:r>
+      <w:proofErr w:type="spellEnd"/>
+      <w:r>
+        <w:rPr>
+          <w:lang w:val="es-CO"/>
+        </w:rPr>
+        <w:t xml:space="preserve"> 03_migrate.py.</w:t>
       </w:r>
     </w:p>
     <w:p>
@@ -656,7 +897,21 @@
         <w:rPr>
           <w:lang w:val="es-CO"/>
         </w:rPr>
-        <w:t>• Ejecutar python 04_verify.py.</w:t>
+        <w:t xml:space="preserve">• Ejecutar </w:t>
+      </w:r>
+      <w:proofErr w:type="spellStart"/>
+      <w:r>
+        <w:rPr>
+          <w:lang w:val="es-CO"/>
+        </w:rPr>
+        <w:t>python</w:t>
+      </w:r>
+      <w:proofErr w:type="spellEnd"/>
+      <w:r>
+        <w:rPr>
+          <w:lang w:val="es-CO"/>
+        </w:rPr>
+        <w:t xml:space="preserve"> 04_verify.py.</w:t>
       </w:r>
     </w:p>
     <w:p>
@@ -737,6 +992,7 @@
         <w:pStyle w:val="Ttulo1"/>
         <w:spacing w:before="100" w:after="60"/>
         <w:rPr>
+          <w:rFonts w:ascii="Arial" w:eastAsia="Arial" w:hAnsi="Arial"/>
           <w:color w:val="auto"/>
           <w:lang w:val="es-CO"/>
         </w:rPr>
@@ -744,15 +1000,14 @@
       <w:r>
         <w:rPr>
           <w:rFonts w:ascii="Arial" w:eastAsia="Arial" w:hAnsi="Arial"/>
-          <w:noProof/>
           <w:color w:val="auto"/>
           <w:lang w:val="es-CO"/>
         </w:rPr>
         <w:drawing>
-          <wp:inline distT="0" distB="0" distL="0" distR="0" wp14:anchorId="03291806" wp14:editId="574B5845">
-            <wp:extent cx="6217920" cy="5172075"/>
-            <wp:effectExtent l="0" t="0" r="0" b="9525"/>
-            <wp:docPr id="6" name="Imagen 6"/>
+          <wp:inline distT="0" distB="0" distL="0" distR="0" wp14:anchorId="63ACFFB0" wp14:editId="3E6B51D4">
+            <wp:extent cx="6217920" cy="3515995"/>
+            <wp:effectExtent l="0" t="0" r="0" b="8255"/>
+            <wp:docPr id="10" name="Imagen 10"/>
             <wp:cNvGraphicFramePr>
               <a:graphicFrameLocks xmlns:a="http://schemas.openxmlformats.org/drawingml/2006/main" noChangeAspect="1"/>
             </wp:cNvGraphicFramePr>
@@ -772,336 +1027,7 @@
                   <pic:spPr>
                     <a:xfrm>
                       <a:off x="0" y="0"/>
-                      <a:ext cx="6217920" cy="5172075"/>
-                    </a:xfrm>
-                    <a:prstGeom prst="rect">
-                      <a:avLst/>
-                    </a:prstGeom>
-                  </pic:spPr>
-                </pic:pic>
-              </a:graphicData>
-            </a:graphic>
-          </wp:inline>
-        </w:drawing>
-      </w:r>
-      <w:r>
-        <w:rPr>
-          <w:rFonts w:ascii="Arial" w:eastAsia="Arial" w:hAnsi="Arial"/>
-          <w:color w:val="auto"/>
-          <w:lang w:val="es-CO"/>
-        </w:rPr>
-        <w:t>6. Decisiones de Embedding y Referencing</w:t>
-      </w:r>
-    </w:p>
-    <w:p>
-      <w:pPr>
-        <w:rPr>
-          <w:lang w:val="es-CO"/>
-        </w:rPr>
-      </w:pPr>
-      <w:r>
-        <w:rPr>
-          <w:lang w:val="es-CO"/>
-        </w:rPr>
-        <w:t>Embedding: se usa para datos que suelen consultarse junto con el documento principal. Por eso las direcciones forman parte del cliente y los artículos, el pago y la dirección de envío forman parte del pedido.</w:t>
-      </w:r>
-    </w:p>
-    <w:p>
-      <w:pPr>
-        <w:rPr>
-          <w:lang w:val="es-CO"/>
-        </w:rPr>
-      </w:pPr>
-      <w:r>
-        <w:rPr>
-          <w:lang w:val="es-CO"/>
-        </w:rPr>
-        <w:t>Referencing: se usa para mantener documentos independientes y relacionarlos mediante identificadores. Los productos referencian a proveedores; los pedidos, a clientes; y las reseñas, a clientes y productos.</w:t>
-      </w:r>
-    </w:p>
-    <w:p>
-      <w:pPr>
-        <w:rPr>
-          <w:lang w:val="es-CO"/>
-        </w:rPr>
-      </w:pPr>
-      <w:r>
-        <w:rPr>
-          <w:i/>
-          <w:lang w:val="es-CO"/>
-        </w:rPr>
-        <w:t>.</w:t>
-      </w:r>
-    </w:p>
-    <w:p>
-      <w:pPr>
-        <w:pStyle w:val="Ttulo1"/>
-        <w:spacing w:before="100" w:after="60"/>
-        <w:rPr>
-          <w:color w:val="auto"/>
-          <w:lang w:val="es-CO"/>
-        </w:rPr>
-      </w:pPr>
-      <w:r>
-        <w:rPr>
-          <w:rFonts w:ascii="Arial" w:eastAsia="Arial" w:hAnsi="Arial"/>
-          <w:color w:val="auto"/>
-          <w:lang w:val="es-CO"/>
-        </w:rPr>
-        <w:lastRenderedPageBreak/>
-        <w:t>7. Consultas de agregación</w:t>
-      </w:r>
-    </w:p>
-    <w:p>
-      <w:pPr>
-        <w:spacing w:after="40"/>
-        <w:rPr>
-          <w:lang w:val="es-CO"/>
-        </w:rPr>
-      </w:pPr>
-    </w:p>
-    <w:p>
-      <w:pPr>
-        <w:spacing w:after="40"/>
-        <w:rPr>
-          <w:lang w:val="es-CO"/>
-        </w:rPr>
-      </w:pPr>
-      <w:r>
-        <w:rPr>
-          <w:b/>
-          <w:lang w:val="es-CO"/>
-        </w:rPr>
-        <w:t xml:space="preserve">1. Productos más vendidos: </w:t>
-      </w:r>
-      <w:r>
-        <w:rPr>
-          <w:lang w:val="es-CO"/>
-        </w:rPr>
-        <w:t>ayuda a planear inventario y reposición.</w:t>
-      </w:r>
-    </w:p>
-    <w:p>
-      <w:pPr>
-        <w:spacing w:after="40"/>
-        <w:rPr>
-          <w:lang w:val="es-CO"/>
-        </w:rPr>
-      </w:pPr>
-      <w:r>
-        <w:rPr>
-          <w:b/>
-          <w:lang w:val="es-CO"/>
-        </w:rPr>
-        <w:t xml:space="preserve">2. Ingresos por categoría: </w:t>
-      </w:r>
-      <w:r>
-        <w:rPr>
-          <w:lang w:val="es-CO"/>
-        </w:rPr>
-        <w:t>permite comparar el aporte de cada categoría.</w:t>
-      </w:r>
-    </w:p>
-    <w:p>
-      <w:pPr>
-        <w:spacing w:after="40"/>
-        <w:rPr>
-          <w:lang w:val="es-CO"/>
-        </w:rPr>
-      </w:pPr>
-      <w:r>
-        <w:rPr>
-          <w:b/>
-          <w:lang w:val="es-CO"/>
-        </w:rPr>
-        <w:t xml:space="preserve">3. Mejores clientes: </w:t>
-      </w:r>
-      <w:r>
-        <w:rPr>
-          <w:lang w:val="es-CO"/>
-        </w:rPr>
-        <w:t>apoya acciones de fidelización.</w:t>
-      </w:r>
-    </w:p>
-    <w:p>
-      <w:pPr>
-        <w:spacing w:after="40"/>
-        <w:rPr>
-          <w:lang w:val="es-CO"/>
-        </w:rPr>
-      </w:pPr>
-      <w:r>
-        <w:rPr>
-          <w:b/>
-          <w:lang w:val="es-CO"/>
-        </w:rPr>
-        <w:t xml:space="preserve">4. Ventas mensuales: </w:t>
-      </w:r>
-      <w:r>
-        <w:rPr>
-          <w:lang w:val="es-CO"/>
-        </w:rPr>
-        <w:t>facilita observar tendencias y planear campañas.</w:t>
-      </w:r>
-    </w:p>
-    <w:p>
-      <w:pPr>
-        <w:spacing w:after="40"/>
-        <w:rPr>
-          <w:lang w:val="es-CO"/>
-        </w:rPr>
-      </w:pPr>
-      <w:r>
-        <w:rPr>
-          <w:b/>
-          <w:lang w:val="es-CO"/>
-        </w:rPr>
-        <w:t xml:space="preserve">5. Productos mejor calificados y proveedores: </w:t>
-      </w:r>
-      <w:r>
-        <w:rPr>
-          <w:lang w:val="es-CO"/>
-        </w:rPr>
-        <w:t>ayuda a identificar productos bien valorados.</w:t>
-      </w:r>
-    </w:p>
-    <w:p>
-      <w:pPr>
-        <w:spacing w:after="40"/>
-        <w:rPr>
-          <w:lang w:val="es-CO"/>
-        </w:rPr>
-      </w:pPr>
-      <w:r>
-        <w:rPr>
-          <w:b/>
-          <w:lang w:val="es-CO"/>
-        </w:rPr>
-        <w:t xml:space="preserve">6. Pagos rechazados con cliente y método de pago: </w:t>
-      </w:r>
-      <w:r>
-        <w:rPr>
-          <w:lang w:val="es-CO"/>
-        </w:rPr>
-        <w:t>apoya la revisión de incidencias.</w:t>
-      </w:r>
-    </w:p>
-    <w:p>
-      <w:pPr>
-        <w:spacing w:after="40"/>
-        <w:rPr>
-          <w:lang w:val="es-CO"/>
-        </w:rPr>
-      </w:pPr>
-      <w:r>
-        <w:rPr>
-          <w:b/>
-          <w:lang w:val="es-CO"/>
-        </w:rPr>
-        <w:t xml:space="preserve">7. Ventas por ciudad: </w:t>
-      </w:r>
-      <w:r>
-        <w:rPr>
-          <w:lang w:val="es-CO"/>
-        </w:rPr>
-        <w:t>muestra la distribución geográfica de las ventas.</w:t>
-      </w:r>
-    </w:p>
-    <w:p>
-      <w:pPr>
-        <w:spacing w:after="40"/>
-        <w:rPr>
-          <w:lang w:val="es-CO"/>
-        </w:rPr>
-      </w:pPr>
-    </w:p>
-    <w:p>
-      <w:pPr>
-        <w:pStyle w:val="Ttulo1"/>
-        <w:spacing w:before="100" w:after="60"/>
-        <w:rPr>
-          <w:color w:val="auto"/>
-          <w:lang w:val="es-CO"/>
-        </w:rPr>
-      </w:pPr>
-      <w:r>
-        <w:rPr>
-          <w:rFonts w:ascii="Arial" w:eastAsia="Arial" w:hAnsi="Arial"/>
-          <w:color w:val="auto"/>
-          <w:lang w:val="es-CO"/>
-        </w:rPr>
-        <w:t>8. Conclusión</w:t>
-      </w:r>
-    </w:p>
-    <w:p>
-      <w:pPr>
-        <w:rPr>
-          <w:lang w:val="es-CO"/>
-        </w:rPr>
-      </w:pPr>
-      <w:r>
-        <w:rPr>
-          <w:lang w:val="es-CO"/>
-        </w:rPr>
-        <w:t>La migración permitió reorganizar los datos relacionales en un modelo documental adaptado a las consultas del sistema. El uso de embedding facilita recuperar información relacionada en un mismo documento, mientras que referencing conserva relaciones entre documentos independientes. La verificación y las consultas de agregación permiten comprobar el resultado y obtener información útil para el análisis del negocio.</w:t>
-      </w:r>
-    </w:p>
-    <w:p>
-      <w:pPr>
-        <w:pStyle w:val="Ttulo1"/>
-        <w:spacing w:before="100" w:after="60"/>
-        <w:rPr>
-          <w:color w:val="auto"/>
-          <w:lang w:val="es-CO"/>
-        </w:rPr>
-      </w:pPr>
-      <w:r>
-        <w:rPr>
-          <w:rFonts w:ascii="Arial" w:eastAsia="Arial" w:hAnsi="Arial"/>
-          <w:color w:val="auto"/>
-          <w:lang w:val="es-CO"/>
-        </w:rPr>
-        <w:t>9. Evidencias adicionales</w:t>
-      </w:r>
-    </w:p>
-    <w:p>
-      <w:pPr>
-        <w:spacing w:before="160" w:after="40"/>
-        <w:jc w:val="center"/>
-        <w:rPr>
-          <w:lang w:val="es-CO"/>
-        </w:rPr>
-      </w:pPr>
-      <w:r>
-        <w:rPr>
-          <w:noProof/>
-          <w:lang w:val="es-CO"/>
-        </w:rPr>
-        <w:drawing>
-          <wp:inline distT="0" distB="0" distL="0" distR="0" wp14:anchorId="0136F683" wp14:editId="0E0D3963">
-            <wp:extent cx="6217920" cy="2463165"/>
-            <wp:effectExtent l="0" t="0" r="0" b="0"/>
-            <wp:docPr id="7" name="Imagen 7"/>
-            <wp:cNvGraphicFramePr>
-              <a:graphicFrameLocks xmlns:a="http://schemas.openxmlformats.org/drawingml/2006/main" noChangeAspect="1"/>
-            </wp:cNvGraphicFramePr>
-            <a:graphic xmlns:a="http://schemas.openxmlformats.org/drawingml/2006/main">
-              <a:graphicData uri="http://schemas.openxmlformats.org/drawingml/2006/picture">
-                <pic:pic xmlns:pic="http://schemas.openxmlformats.org/drawingml/2006/picture">
-                  <pic:nvPicPr>
-                    <pic:cNvPr id="1" name=""/>
-                    <pic:cNvPicPr/>
-                  </pic:nvPicPr>
-                  <pic:blipFill>
-                    <a:blip r:embed="rId13"/>
-                    <a:stretch>
-                      <a:fillRect/>
-                    </a:stretch>
-                  </pic:blipFill>
-                  <pic:spPr>
-                    <a:xfrm>
-                      <a:off x="0" y="0"/>
-                      <a:ext cx="6217920" cy="2463165"/>
+                      <a:ext cx="6217920" cy="3515995"/>
                     </a:xfrm>
                     <a:prstGeom prst="rect">
                       <a:avLst/>
@@ -1116,6 +1042,368 @@
     </w:p>
     <w:p>
       <w:pPr>
+        <w:pStyle w:val="Ttulo1"/>
+        <w:spacing w:before="100" w:after="60"/>
+        <w:rPr>
+          <w:rFonts w:ascii="Arial" w:eastAsia="Arial" w:hAnsi="Arial"/>
+          <w:color w:val="auto"/>
+          <w:lang w:val="es-CO"/>
+        </w:rPr>
+      </w:pPr>
+    </w:p>
+    <w:p>
+      <w:pPr>
+        <w:pStyle w:val="Ttulo1"/>
+        <w:spacing w:before="100" w:after="60"/>
+        <w:rPr>
+          <w:color w:val="auto"/>
+          <w:lang w:val="es-CO"/>
+        </w:rPr>
+      </w:pPr>
+      <w:r>
+        <w:rPr>
+          <w:rFonts w:ascii="Arial" w:eastAsia="Arial" w:hAnsi="Arial"/>
+          <w:color w:val="auto"/>
+          <w:lang w:val="es-CO"/>
+        </w:rPr>
+        <w:t xml:space="preserve">6. Decisiones de </w:t>
+      </w:r>
+      <w:proofErr w:type="spellStart"/>
+      <w:r>
+        <w:rPr>
+          <w:rFonts w:ascii="Arial" w:eastAsia="Arial" w:hAnsi="Arial"/>
+          <w:color w:val="auto"/>
+          <w:lang w:val="es-CO"/>
+        </w:rPr>
+        <w:t>Embedding</w:t>
+      </w:r>
+      <w:proofErr w:type="spellEnd"/>
+      <w:r>
+        <w:rPr>
+          <w:rFonts w:ascii="Arial" w:eastAsia="Arial" w:hAnsi="Arial"/>
+          <w:color w:val="auto"/>
+          <w:lang w:val="es-CO"/>
+        </w:rPr>
+        <w:t xml:space="preserve"> y </w:t>
+      </w:r>
+      <w:proofErr w:type="spellStart"/>
+      <w:r>
+        <w:rPr>
+          <w:rFonts w:ascii="Arial" w:eastAsia="Arial" w:hAnsi="Arial"/>
+          <w:color w:val="auto"/>
+          <w:lang w:val="es-CO"/>
+        </w:rPr>
+        <w:t>Referencing</w:t>
+      </w:r>
+      <w:proofErr w:type="spellEnd"/>
+    </w:p>
+    <w:p>
+      <w:pPr>
+        <w:rPr>
+          <w:lang w:val="es-CO"/>
+        </w:rPr>
+      </w:pPr>
+      <w:proofErr w:type="spellStart"/>
+      <w:r>
+        <w:rPr>
+          <w:lang w:val="es-CO"/>
+        </w:rPr>
+        <w:t>Embedding</w:t>
+      </w:r>
+      <w:proofErr w:type="spellEnd"/>
+      <w:r>
+        <w:rPr>
+          <w:lang w:val="es-CO"/>
+        </w:rPr>
+        <w:t>: se usa para datos que suelen consultarse junto con el documento principal. Por eso las direcciones forman parte del cliente y los artículos, el pago y la dirección de envío forman parte del pedido.</w:t>
+      </w:r>
+    </w:p>
+    <w:p>
+      <w:pPr>
+        <w:rPr>
+          <w:lang w:val="es-CO"/>
+        </w:rPr>
+      </w:pPr>
+      <w:proofErr w:type="spellStart"/>
+      <w:r>
+        <w:rPr>
+          <w:lang w:val="es-CO"/>
+        </w:rPr>
+        <w:t>Referencing</w:t>
+      </w:r>
+      <w:proofErr w:type="spellEnd"/>
+      <w:r>
+        <w:rPr>
+          <w:lang w:val="es-CO"/>
+        </w:rPr>
+        <w:t>: se usa para mantener documentos independientes y relacionarlos mediante identificadores. Los productos referencian a proveedores; los pedidos, a clientes; y las reseñas, a clientes y productos.</w:t>
+      </w:r>
+    </w:p>
+    <w:p>
+      <w:pPr>
+        <w:rPr>
+          <w:lang w:val="es-CO"/>
+        </w:rPr>
+      </w:pPr>
+      <w:r>
+        <w:rPr>
+          <w:i/>
+          <w:lang w:val="es-CO"/>
+        </w:rPr>
+        <w:t>.</w:t>
+      </w:r>
+    </w:p>
+    <w:p>
+      <w:pPr>
+        <w:pStyle w:val="Ttulo1"/>
+        <w:spacing w:before="100" w:after="60"/>
+        <w:rPr>
+          <w:color w:val="auto"/>
+          <w:lang w:val="es-CO"/>
+        </w:rPr>
+      </w:pPr>
+      <w:r>
+        <w:rPr>
+          <w:rFonts w:ascii="Arial" w:eastAsia="Arial" w:hAnsi="Arial"/>
+          <w:color w:val="auto"/>
+          <w:lang w:val="es-CO"/>
+        </w:rPr>
+        <w:t>7. Consultas de agregación</w:t>
+      </w:r>
+    </w:p>
+    <w:p>
+      <w:pPr>
+        <w:spacing w:after="40"/>
+        <w:rPr>
+          <w:lang w:val="es-CO"/>
+        </w:rPr>
+      </w:pPr>
+    </w:p>
+    <w:p>
+      <w:pPr>
+        <w:spacing w:after="40"/>
+        <w:rPr>
+          <w:lang w:val="es-CO"/>
+        </w:rPr>
+      </w:pPr>
+      <w:r>
+        <w:rPr>
+          <w:b/>
+          <w:lang w:val="es-CO"/>
+        </w:rPr>
+        <w:t xml:space="preserve">1. Productos más vendidos: </w:t>
+      </w:r>
+      <w:r>
+        <w:rPr>
+          <w:lang w:val="es-CO"/>
+        </w:rPr>
+        <w:t>ayuda a planear inventario y reposición.</w:t>
+      </w:r>
+    </w:p>
+    <w:p>
+      <w:pPr>
+        <w:spacing w:after="40"/>
+        <w:rPr>
+          <w:lang w:val="es-CO"/>
+        </w:rPr>
+      </w:pPr>
+      <w:r>
+        <w:rPr>
+          <w:b/>
+          <w:lang w:val="es-CO"/>
+        </w:rPr>
+        <w:t xml:space="preserve">2. Ingresos por categoría: </w:t>
+      </w:r>
+      <w:r>
+        <w:rPr>
+          <w:lang w:val="es-CO"/>
+        </w:rPr>
+        <w:t>permite comparar el aporte de cada categoría.</w:t>
+      </w:r>
+    </w:p>
+    <w:p>
+      <w:pPr>
+        <w:spacing w:after="40"/>
+        <w:rPr>
+          <w:lang w:val="es-CO"/>
+        </w:rPr>
+      </w:pPr>
+      <w:r>
+        <w:rPr>
+          <w:b/>
+          <w:lang w:val="es-CO"/>
+        </w:rPr>
+        <w:t xml:space="preserve">3. Mejores clientes: </w:t>
+      </w:r>
+      <w:r>
+        <w:rPr>
+          <w:lang w:val="es-CO"/>
+        </w:rPr>
+        <w:t>apoya acciones de fidelización.</w:t>
+      </w:r>
+    </w:p>
+    <w:p>
+      <w:pPr>
+        <w:spacing w:after="40"/>
+        <w:rPr>
+          <w:lang w:val="es-CO"/>
+        </w:rPr>
+      </w:pPr>
+      <w:r>
+        <w:rPr>
+          <w:b/>
+          <w:lang w:val="es-CO"/>
+        </w:rPr>
+        <w:t xml:space="preserve">4. Ventas mensuales: </w:t>
+      </w:r>
+      <w:r>
+        <w:rPr>
+          <w:lang w:val="es-CO"/>
+        </w:rPr>
+        <w:t>facilita observar tendencias y planear campañas.</w:t>
+      </w:r>
+    </w:p>
+    <w:p>
+      <w:pPr>
+        <w:spacing w:after="40"/>
+        <w:rPr>
+          <w:lang w:val="es-CO"/>
+        </w:rPr>
+      </w:pPr>
+      <w:r>
+        <w:rPr>
+          <w:b/>
+          <w:lang w:val="es-CO"/>
+        </w:rPr>
+        <w:t xml:space="preserve">5. Productos mejor calificados y proveedores: </w:t>
+      </w:r>
+      <w:r>
+        <w:rPr>
+          <w:lang w:val="es-CO"/>
+        </w:rPr>
+        <w:t>ayuda a identificar productos bien valorados.</w:t>
+      </w:r>
+    </w:p>
+    <w:p>
+      <w:pPr>
+        <w:spacing w:after="40"/>
+        <w:rPr>
+          <w:lang w:val="es-CO"/>
+        </w:rPr>
+      </w:pPr>
+      <w:r>
+        <w:rPr>
+          <w:b/>
+          <w:lang w:val="es-CO"/>
+        </w:rPr>
+        <w:t xml:space="preserve">6. Pagos rechazados con cliente y método de pago: </w:t>
+      </w:r>
+      <w:r>
+        <w:rPr>
+          <w:lang w:val="es-CO"/>
+        </w:rPr>
+        <w:t>apoya la revisión de incidencias.</w:t>
+      </w:r>
+    </w:p>
+    <w:p>
+      <w:pPr>
+        <w:spacing w:after="40"/>
+        <w:rPr>
+          <w:lang w:val="es-CO"/>
+        </w:rPr>
+      </w:pPr>
+      <w:r>
+        <w:rPr>
+          <w:b/>
+          <w:lang w:val="es-CO"/>
+        </w:rPr>
+        <w:lastRenderedPageBreak/>
+        <w:t xml:space="preserve">7. Ventas por ciudad: </w:t>
+      </w:r>
+      <w:r>
+        <w:rPr>
+          <w:lang w:val="es-CO"/>
+        </w:rPr>
+        <w:t>muestra la distribución geográfica de las ventas.</w:t>
+      </w:r>
+    </w:p>
+    <w:p>
+      <w:pPr>
+        <w:spacing w:after="40"/>
+        <w:rPr>
+          <w:lang w:val="es-CO"/>
+        </w:rPr>
+      </w:pPr>
+    </w:p>
+    <w:p>
+      <w:pPr>
+        <w:pStyle w:val="Ttulo1"/>
+        <w:spacing w:before="100" w:after="60"/>
+        <w:rPr>
+          <w:color w:val="auto"/>
+          <w:lang w:val="es-CO"/>
+        </w:rPr>
+      </w:pPr>
+      <w:r>
+        <w:rPr>
+          <w:rFonts w:ascii="Arial" w:eastAsia="Arial" w:hAnsi="Arial"/>
+          <w:color w:val="auto"/>
+          <w:lang w:val="es-CO"/>
+        </w:rPr>
+        <w:t>8. Conclusión</w:t>
+      </w:r>
+    </w:p>
+    <w:p>
+      <w:pPr>
+        <w:rPr>
+          <w:lang w:val="es-CO"/>
+        </w:rPr>
+      </w:pPr>
+      <w:r>
+        <w:rPr>
+          <w:lang w:val="es-CO"/>
+        </w:rPr>
+        <w:t xml:space="preserve">La migración permitió reorganizar los datos relacionales en un modelo documental adaptado a las consultas del sistema. El uso de </w:t>
+      </w:r>
+      <w:proofErr w:type="spellStart"/>
+      <w:r>
+        <w:rPr>
+          <w:lang w:val="es-CO"/>
+        </w:rPr>
+        <w:t>embedding</w:t>
+      </w:r>
+      <w:proofErr w:type="spellEnd"/>
+      <w:r>
+        <w:rPr>
+          <w:lang w:val="es-CO"/>
+        </w:rPr>
+        <w:t xml:space="preserve"> facilita recuperar información relacionada en un mismo documento, mientras que </w:t>
+      </w:r>
+      <w:proofErr w:type="spellStart"/>
+      <w:r>
+        <w:rPr>
+          <w:lang w:val="es-CO"/>
+        </w:rPr>
+        <w:t>referencing</w:t>
+      </w:r>
+      <w:proofErr w:type="spellEnd"/>
+      <w:r>
+        <w:rPr>
+          <w:lang w:val="es-CO"/>
+        </w:rPr>
+        <w:t xml:space="preserve"> conserva relaciones entre documentos independientes. La verificación y las consultas de agregación permiten comprobar el resultado y obtener información útil para el análisis del negocio.</w:t>
+      </w:r>
+    </w:p>
+    <w:p>
+      <w:pPr>
+        <w:spacing w:before="160" w:after="40"/>
+        <w:rPr>
+          <w:lang w:val="es-CO"/>
+        </w:rPr>
+      </w:pPr>
+    </w:p>
+    <w:p>
+      <w:pPr>
         <w:jc w:val="center"/>
         <w:rPr>
           <w:lang w:val="es-CO"/>
@@ -1123,7 +1411,7 @@
       </w:pPr>
     </w:p>
     <w:sectPr>
-      <w:footerReference w:type="default" r:id="rId14"/>
+      <w:footerReference w:type="default" r:id="rId13"/>
       <w:pgSz w:w="12240" w:h="15840"/>
       <w:pgMar w:top="1008" w:right="1224" w:bottom="1008" w:left="1224" w:header="720" w:footer="720" w:gutter="0"/>
       <w:cols w:space="720"/>

</xml_diff>